<commit_message>
docs(lettre misaal): demande recentrée sur l'événementiel
La lettre demandait l'agrément pour la seule couverture audiovisuelle.
Elle demande maintenant l'agrément comme prestataire événementiel :
conception du déroulé, habillage de la scène et de la salle, son,
lumière et écrans, minutage et présence jusqu'au démontage. La
production vidéo devient l'argument différenciant — matériel et montage
en propre, livrables remis sans second prestataire — au lieu d'être
l'objet de la demande.

Co-Authored-By: Claude Opus 5 <noreply@anthropic.com>
Claude-Session: https://claude.ai/code/session_01G6UQqMTpJ9TWrJ7oJutcLt
</commit_message>
<xml_diff>
--- a/docs/lettre-agrement-fonstab-misaal-crea.docx
+++ b/docs/lettre-agrement-fonstab-misaal-crea.docx
@@ -28,7 +28,7 @@
           <w:color w:val="555555"/>
           <w:sz w:val="17"/>
         </w:rPr>
-        <w:t>Production audiovisuelle — cinéma, télévision, formation</w:t>
+        <w:t>Organisation de manifestations — production audiovisuelle</w:t>
       </w:r>
     </w:p>
     <w:p>
@@ -130,7 +130,7 @@
           <w:b/>
           <w:i w:val="0"/>
         </w:rPr>
-        <w:t>Objet : demande d'agrément — couverture audiovisuelle des manifestations</w:t>
+        <w:t>Objet : demande d'agrément — organisation et couverture de manifestations</w:t>
       </w:r>
     </w:p>
     <w:p>
@@ -156,7 +156,7 @@
           <w:b w:val="0"/>
           <w:i w:val="0"/>
         </w:rPr>
-        <w:t>Misaal Créa est une société de production audiovisuelle qui exerce à Dakar depuis 2016. Nous sollicitons votre agrément pour la couverture audiovisuelle de vos manifestations.</w:t>
+        <w:t>Misaal Créa est une société établie à Dakar depuis 2016. Nous organisons des manifestations professionnelles et institutionnelles — ateliers, séminaires, cérémonies, lancements, visites de terrain — et nous en assurons le traitement audiovisuel. Nous sollicitons votre agrément comme prestataire événementiel.</w:t>
       </w:r>
     </w:p>
     <w:p>
@@ -169,7 +169,7 @@
           <w:b w:val="0"/>
           <w:i w:val="0"/>
         </w:rPr>
-        <w:t>Nous filmons vos rencontres — ateliers, cérémonies, visites de terrain, remises officielles — et nous en tirons ce qui vous sert ensuite : un film de restitution, des séquences courtes pour vos supports de communication, des photographies, et l'enregistrement intégral des interventions lorsque vous souhaitez en garder la trace.</w:t>
+        <w:t>Notre intervention commence à la conception : choix du lieu, déroulé minuté, habillage de la scène et de la salle. Le jour venu, nous installons le son, la lumière et les écrans, nous tenons le minutage des interventions et nous restons en salle jusqu'au démontage.</w:t>
       </w:r>
     </w:p>
     <w:p>
@@ -182,7 +182,7 @@
           <w:b w:val="0"/>
           <w:i w:val="0"/>
         </w:rPr>
-        <w:t>Nous assurons également la diffusion en direct à l'intention des participants qui ne peuvent se déplacer, la projection sur écran pendant la rencontre et la préparation des génériques et habillages qui l'accompagnent.</w:t>
+        <w:t>Notre métier d'origine, la production vidéo, fait la différence sur le reste : caméras, matériel son et lumière et salle de montage nous appartiennent. Vous repartez donc de chaque manifestation avec un film de restitution, des séquences courtes pour vos supports, des photographies et l'enregistrement des interventions, sans passer par un second prestataire. La diffusion en direct est possible pour les participants qui ne peuvent se déplacer.</w:t>
       </w:r>
     </w:p>
     <w:p>
@@ -195,7 +195,7 @@
           <w:b w:val="0"/>
           <w:i w:val="0"/>
         </w:rPr>
-        <w:t>La société dispose de ses caméras, de son matériel de son et de lumière et de sa salle de montage. La prise de vue et le montage étant conduits par la même équipe, les délais de livraison restent courts et le coût maîtrisé. Nous animons par ailleurs des sessions de formation à la prise de vue et au montage, qui relèvent aussi de notre objet social.</w:t>
+        <w:t>Chaque manifestation fait l'objet d'un devis préalable, d'un interlocuteur unique jusqu'à la livraison, et d'une remise des images et du film dans les jours qui suivent.</w:t>
       </w:r>
     </w:p>
     <w:p>

</xml_diff>

<commit_message>
docs(lettre misaal): ouverture réécrite, date du 12 juillet 2026
Les deux premiers paragraphes sont refaits de bout en bout — la demande
d'agrément ouvre la lettre, la présentation de la société suit, et la
préparation de la rencontre est décrite autrement — à message
équivalent. Date portée au 12 juillet 2026.

Co-Authored-By: Claude Opus 5 <noreply@anthropic.com>
Claude-Session: https://claude.ai/code/session_01G6UQqMTpJ9TWrJ7oJutcLt
</commit_message>
<xml_diff>
--- a/docs/lettre-agrement-fonstab-misaal-crea.docx
+++ b/docs/lettre-agrement-fonstab-misaal-crea.docx
@@ -118,7 +118,7 @@
           <w:b w:val="0"/>
           <w:i w:val="0"/>
         </w:rPr>
-        <w:t>Dakar, le 24 septembre 2026</w:t>
+        <w:t>Dakar, le 12 juillet 2026</w:t>
       </w:r>
     </w:p>
     <w:p>
@@ -156,7 +156,7 @@
           <w:b w:val="0"/>
           <w:i w:val="0"/>
         </w:rPr>
-        <w:t>Misaal Créa est une société établie à Dakar depuis 2016. Nous organisons des manifestations professionnelles et institutionnelles — ateliers, séminaires, cérémonies, lancements, visites de terrain — et nous en assurons le traitement audiovisuel. Nous sollicitons votre agrément comme prestataire événementiel.</w:t>
+        <w:t>Nous sollicitons votre agrément en qualité de prestataire événementiel. Misaal Créa exerce à Dakar depuis 2016 : nous montons des manifestations professionnelles et institutionnelles — ateliers, séminaires, cérémonies, lancements, visites de terrain — et nous en produisons nous-mêmes les images.</w:t>
       </w:r>
     </w:p>
     <w:p>
@@ -169,7 +169,7 @@
           <w:b w:val="0"/>
           <w:i w:val="0"/>
         </w:rPr>
-        <w:t>Notre intervention commence à la conception : choix du lieu, déroulé minuté, habillage de la scène et de la salle. Le jour venu, nous installons le son, la lumière et les écrans, nous tenons le minutage des interventions et nous restons en salle jusqu'au démontage.</w:t>
+        <w:t>Une rencontre se prépare avant d'être filmée. Nous arrêtons son déroulé et son minutage, retenons le lieu et l'habillons, montons le son, la lumière et les écrans, puis nous tenons la salle depuis le mot d'accueil jusqu'au démontage.</w:t>
       </w:r>
     </w:p>
     <w:p>

</xml_diff>

<commit_message>
docs(lettre misaal): conception et organisation d'événements de bout en bout
La lettre partait du métier audiovisuel ; elle part maintenant de
l'intention de la rencontre, du concept et de la scénographie, puis
déroule l'exécution complète — lieu, identité visuelle, fichier des
invités, coordination des prestataires, direction de la séance,
restauration, démontage — et la remise d'un dossier de clôture. La
production des images devient un moyen cité en une phrase.

Le pied de page est supprimé : RCCM et NINEA figurent en en-tête, comme
sur les lettres Michelle Traiding et Full Logistics.

Co-Authored-By: Claude Opus 5 <noreply@anthropic.com>
Claude-Session: https://claude.ai/code/session_01G6UQqMTpJ9TWrJ7oJutcLt
</commit_message>
<xml_diff>
--- a/docs/lettre-agrement-fonstab-misaal-crea.docx
+++ b/docs/lettre-agrement-fonstab-misaal-crea.docx
@@ -28,7 +28,7 @@
           <w:color w:val="555555"/>
           <w:sz w:val="17"/>
         </w:rPr>
-        <w:t>Organisation de manifestations — production audiovisuelle</w:t>
+        <w:t>Conception et organisation d'événements</w:t>
       </w:r>
     </w:p>
     <w:p>
@@ -48,7 +48,7 @@
     </w:p>
     <w:p>
       <w:pPr>
-        <w:spacing w:after="520"/>
+        <w:spacing w:after="40"/>
         <w:jc w:val="right"/>
       </w:pPr>
       <w:r>
@@ -59,6 +59,21 @@
           <w:sz w:val="17"/>
         </w:rPr>
         <w:t>Tél. : +221 77 645 90 48</w:t>
+      </w:r>
+    </w:p>
+    <w:p>
+      <w:pPr>
+        <w:spacing w:after="480"/>
+        <w:jc w:val="right"/>
+      </w:pPr>
+      <w:r>
+        <w:rPr>
+          <w:b w:val="0"/>
+          <w:i w:val="0"/>
+          <w:color w:val="555555"/>
+          <w:sz w:val="16"/>
+        </w:rPr>
+        <w:t>RCCM SN DKR 2016 B 19405  ·  NINEA 006037908</w:t>
       </w:r>
     </w:p>
     <w:p>
@@ -99,7 +114,7 @@
     </w:p>
     <w:p>
       <w:pPr>
-        <w:spacing w:after="440"/>
+        <w:spacing w:after="400"/>
       </w:pPr>
       <w:r>
         <w:rPr>
@@ -111,7 +126,7 @@
     </w:p>
     <w:p>
       <w:pPr>
-        <w:spacing w:after="360"/>
+        <w:spacing w:after="320"/>
       </w:pPr>
       <w:r>
         <w:rPr>
@@ -123,19 +138,19 @@
     </w:p>
     <w:p>
       <w:pPr>
-        <w:spacing w:after="320"/>
+        <w:spacing w:after="280"/>
       </w:pPr>
       <w:r>
         <w:rPr>
           <w:b/>
           <w:i w:val="0"/>
         </w:rPr>
-        <w:t>Objet : demande d'agrément — organisation et couverture de manifestations</w:t>
+        <w:t>Objet : demande d'agrément — conception et organisation d'événements</w:t>
       </w:r>
     </w:p>
     <w:p>
       <w:pPr>
-        <w:spacing w:after="200"/>
+        <w:spacing w:after="180"/>
         <w:jc w:val="both"/>
       </w:pPr>
       <w:r>
@@ -148,7 +163,7 @@
     </w:p>
     <w:p>
       <w:pPr>
-        <w:spacing w:after="200"/>
+        <w:spacing w:after="180"/>
         <w:jc w:val="both"/>
       </w:pPr>
       <w:r>
@@ -156,12 +171,12 @@
           <w:b w:val="0"/>
           <w:i w:val="0"/>
         </w:rPr>
-        <w:t>Nous sollicitons votre agrément en qualité de prestataire événementiel. Misaal Créa exerce à Dakar depuis 2016 : nous montons des manifestations professionnelles et institutionnelles — ateliers, séminaires, cérémonies, lancements, visites de terrain — et nous en produisons nous-mêmes les images.</w:t>
+        <w:t>Nous sollicitons votre agrément en qualité d'organisateur d'événements.</w:t>
       </w:r>
     </w:p>
     <w:p>
       <w:pPr>
-        <w:spacing w:after="200"/>
+        <w:spacing w:after="180"/>
         <w:jc w:val="both"/>
       </w:pPr>
       <w:r>
@@ -169,12 +184,12 @@
           <w:b w:val="0"/>
           <w:i w:val="0"/>
         </w:rPr>
-        <w:t>Une rencontre se prépare avant d'être filmée. Nous arrêtons son déroulé et son minutage, retenons le lieu et l'habillons, montons le son, la lumière et les écrans, puis nous tenons la salle depuis le mot d'accueil jusqu'au démontage.</w:t>
+        <w:t>Misaal Créa imagine et réalise des manifestations professionnelles et institutionnelles. Notre point de départ n'est jamais un catalogue de prestations, mais une intention : ce que la rencontre doit produire, devant qui, dans quel délai et pour quel budget. Nous en tirons un concept, un déroulé et une scénographie, que nous soumettons avant tout engagement de dépense.</w:t>
       </w:r>
     </w:p>
     <w:p>
       <w:pPr>
-        <w:spacing w:after="200"/>
+        <w:spacing w:after="180"/>
         <w:jc w:val="both"/>
       </w:pPr>
       <w:r>
@@ -182,12 +197,12 @@
           <w:b w:val="0"/>
           <w:i w:val="0"/>
         </w:rPr>
-        <w:t>Notre métier d'origine, la production vidéo, fait la différence sur le reste : caméras, matériel son et lumière et salle de montage nous appartiennent. Vous repartez donc de chaque manifestation avec un film de restitution, des séquences courtes pour vos supports, des photographies et l'enregistrement des interventions, sans passer par un second prestataire. La diffusion en direct est possible pour les participants qui ne peuvent se déplacer.</w:t>
+        <w:t>Vient ensuite l'exécution, que nous assurons nous-mêmes : choix et réservation du lieu, identité visuelle de la rencontre — décor, habillage de scène, signalétique, supports imprimés —, constitution et suivi du fichier des invités, sélection et coordination des prestataires, direction de la séance et tenue du minutage, restauration, puis démontage et remise du site. L'équipe qui a conçu l'événement est celle qui le monte et qui le tient le jour dit.</w:t>
       </w:r>
     </w:p>
     <w:p>
       <w:pPr>
-        <w:spacing w:after="200"/>
+        <w:spacing w:after="180"/>
         <w:jc w:val="both"/>
       </w:pPr>
       <w:r>
@@ -195,12 +210,12 @@
           <w:b w:val="0"/>
           <w:i w:val="0"/>
         </w:rPr>
-        <w:t>Chaque manifestation fait l'objet d'un devis préalable, d'un interlocuteur unique jusqu'à la livraison, et d'une remise des images et du film dans les jours qui suivent.</w:t>
+        <w:t>À la clôture, nous remettons un dossier complet : liste de présence, reportage photographique, film de restitution et récapitulatif des dépenses appuyé des justificatifs. Ces contenus sont produits par notre propre studio, sans intervenant extérieur, ce qui raccourcit les délais de livraison.</w:t>
       </w:r>
     </w:p>
     <w:p>
       <w:pPr>
-        <w:spacing w:after="200"/>
+        <w:spacing w:after="180"/>
         <w:jc w:val="both"/>
       </w:pPr>
       <w:r>
@@ -208,12 +223,12 @@
           <w:b w:val="0"/>
           <w:i w:val="0"/>
         </w:rPr>
-        <w:t>Misaal Créa SARL est immatriculée au registre du commerce sous le numéro SN DKR 2016 B 19405 et dispose du NINEA 006037908. Ses activités déclarées portent sur la production vidéo — cinéma et télévision — ainsi que sur la formation.</w:t>
+        <w:t>Chaque projet est conduit par un chef de projet unique, joignable du premier rendez-vous jusqu'à la remise du dossier, sur un budget arrêté d'avance.</w:t>
       </w:r>
     </w:p>
     <w:p>
       <w:pPr>
-        <w:spacing w:after="200"/>
+        <w:spacing w:after="180"/>
         <w:jc w:val="both"/>
       </w:pPr>
       <w:r>
@@ -221,12 +236,12 @@
           <w:b w:val="0"/>
           <w:i w:val="0"/>
         </w:rPr>
-        <w:t>Les documents d'immatriculation sont joints à la présente. Nous nous tenons prêts à vous présenter nos réalisations.</w:t>
+        <w:t>Misaal Créa SARL exerce à Dakar depuis 2016. Ses activités déclarées portent sur la production vidéo — cinéma et télévision — ainsi que sur la formation. Les documents d'immatriculation sont joints à la présente.</w:t>
       </w:r>
     </w:p>
     <w:p>
       <w:pPr>
-        <w:spacing w:after="200"/>
+        <w:spacing w:after="180"/>
         <w:jc w:val="both"/>
       </w:pPr>
       <w:r>
@@ -234,7 +249,7 @@
           <w:b w:val="0"/>
           <w:i w:val="0"/>
         </w:rPr>
-        <w:t>Nous vous prions de croire, Madame l'Administratrice, à l'assurance de notre parfaite considération.</w:t>
+        <w:t>Nous nous tenons prêts à vous présenter nos réalisations et vous prions de croire, Madame l'Administratrice, à l'assurance de notre parfaite considération.</w:t>
       </w:r>
     </w:p>
     <w:p>
@@ -244,7 +259,7 @@
     </w:p>
     <w:p>
       <w:pPr>
-        <w:spacing w:after="440"/>
+        <w:spacing w:after="0"/>
       </w:pPr>
       <w:r>
         <w:rPr>
@@ -254,23 +269,9 @@
         <w:t>Le Gérant</w:t>
       </w:r>
     </w:p>
-    <w:p>
-      <w:pPr>
-        <w:spacing w:after="0"/>
-      </w:pPr>
-      <w:r>
-        <w:rPr>
-          <w:b w:val="0"/>
-          <w:i w:val="0"/>
-          <w:color w:val="777777"/>
-          <w:sz w:val="15"/>
-        </w:rPr>
-        <w:t>MISAAL CRÉA SARL au capital de 100 000 F CFA — RCCM SN DKR 2016 B 19405 — NINEA 006037908 — HLM 4, Villa n° 1385, Dakar — Tél. : +221 77 645 90 48</w:t>
-      </w:r>
-    </w:p>
     <w:sectPr>
       <w:pgSz w:w="12240" w:h="15840"/>
-      <w:pgMar w:top="1020" w:right="1361" w:bottom="794" w:left="1361" w:header="720" w:footer="720" w:gutter="0"/>
+      <w:pgMar w:top="907" w:right="1304" w:bottom="794" w:left="1304" w:header="720" w:footer="720" w:gutter="0"/>
       <w:cols w:space="720"/>
       <w:docGrid w:linePitch="360"/>
     </w:sectPr>
@@ -642,7 +643,7 @@
     <w:qFormat/>
     <w:rsid w:val="00FC693F"/>
     <w:pPr>
-      <w:spacing w:after="200" w:line="276" w:lineRule="auto"/>
+      <w:spacing w:after="180" w:line="269" w:lineRule="auto"/>
     </w:pPr>
     <w:rPr>
       <w:rFonts w:ascii="Calibri" w:hAnsi="Calibri"/>

</xml_diff>